<commit_message>
Phase 6d-6f: embedding-drift TTA trial + root-cause analysis, fold into paper
Fifth independent oracle-diagnostic trial (frozen-backbone embedding
displacement instead of hand-crafted RSSI stats) is negative, and worse at
leave-site-out than the RSSI-stats trials. Root-caused via two follow-ups:
trunk weight divergence ruled out (cosine sim >0.999 across all sites),
modest feature-scale confound found instead, and leave-site-out predictions
shown to collapse to a near-constant band rather than tracking true drift
severity. Paper's Discussion 7.5 and Methodology 4.5 updated to report the
fifth trial and its mechanistic explanation.
</commit_message>
<xml_diff>
--- a/paper/paper_draft_v2.docx
+++ b/paper/paper_draft_v2.docx
@@ -820,7 +820,7 @@
           <w:i w:val="false"/>
           <w:iCs w:val="false"/>
         </w:rPr>
-        <w:t xml:space="preserve">We ran this diagnostic four times, each a genuinely different test rather than a repetition: (i) on HDLC alone using its own real, physically-caused drift (partition-board obstructions at fixed corridor locations); (ii) on HDLC alone using synthetic, spatially-generic drift (a random-walk RSSI attenuation plus ramping access-point dropout, with severity drawn independently per buffer instance, decoupled from location); (iii) the same synthetic mechanism pooled across all six pretraining sites, with a leave-entire-site-out test added as the strictest possible generalization check; and (iv) the pooled setting again with two principled corrections — removing a feature that directly encoded site identity, and normalizing the prediction target to each site's own baseline, which is the conceptually correct framing for drift-relative-to-normal in the first place. Full detail in Section 7.5 and PIVOT_PLAN.md.</w:t>
+        <w:t xml:space="preserve">We ran this diagnostic five times, each a genuinely different test rather than a repetition: (i) on HDLC alone using its own real, physically-caused drift (partition-board obstructions at fixed corridor locations); (ii) on HDLC alone using synthetic, spatially-generic drift (a random-walk RSSI attenuation plus ramping access-point dropout, with severity drawn independently per buffer instance, decoupled from location); (iii) the same synthetic mechanism pooled across all six pretraining sites, with a leave-entire-site-out test added as the strictest possible generalization check; (iv) the pooled setting again with two principled corrections — removing a feature that directly encoded site identity, and normalizing the prediction target to each site's own baseline, which is the conceptually correct framing for drift-relative-to-normal in the first place; and (v) replacing the hand-crafted buffer statistics entirely with a feature source of a genuinely different kind — displacement in the frozen backbone's own learned 128-dimensional bottleneck embedding between a reference and a current buffer, on the reasoning that a representation already optimized for localization might carry drift information more directly than generic RSSI summary statistics. Full detail in Section 7.5 and PIVOT_PLAN.md.</w:t>
       </w:r>
     </w:p>
     <w:p>
@@ -1070,7 +1070,37 @@
           <w:i w:val="false"/>
           <w:iCs w:val="false"/>
         </w:rPr>
-        <w:t xml:space="preserve">Repeating the diagnostic with synthetic, spatially generic drift instead of HDLC's real obstruction drift confirms this root cause directly: a real, non-negative signal appears where there was none before (leave-points-out R² moves from -0.070 to 0.096 for a random forest, and from -0.098 to 0.057 for a linear ridge regression), which is direct evidence that the original negative result was about HDLC's specific drift structure, not an inherent property of buffer statistics or this backbone. It is not, however, sufficient to proceed: point identity alone still explains more of the variance (R²=0.333) than the buffer statistics do, the same confound signature the diagnostic exists to catch, just less severe. Pooling the same diagnostic across all six pretraining sites — hypothesising that HDLC's small pool of 116 held-out points was itself inflating the apparent importance of location — made the confound worse, not better (identity R²=0.685), and a leave-entire-site-out test (predicting an unseen site's drift-induced error using only patterns learned from other sites) was negative (R²=-0.052). Two further, principled corrections — removing a feature that directly encoded site identity, and normalizing the prediction target to each site's own baseline rather than an absolute scale — did not recover a cross-site signal either (leave-site-out R²=-0.268 after normalization). We treat this as a complete, four-times-replicated negative finding: reference-relative buffer statistics, in the form used here and in the prior work this design was adapted from, do not carry a usable signal about drift-induced localization error that generalizes across physical locations in this setting, and we do not proceed to hypernetwork training on top of this backbone as a result. We consider a rigorously falsified hypothesis, investigated this thoroughly, a more valuable and more honest contribution than an unvalidated positive result would have been.</w:t>
+        <w:t xml:space="preserve">Repeating the diagnostic with synthetic, spatially generic drift instead of HDLC's real obstruction drift confirms this root cause directly: a real, non-negative signal appears where there was none before (leave-points-out R² moves from -0.070 to 0.096 for a random forest, and from -0.098 to 0.057 for a linear ridge regression), which is direct evidence that the original negative result was about HDLC's specific drift structure, not an inherent property of buffer statistics or this backbone. It is not, however, sufficient to proceed: point identity alone still explains more of the variance (R²=0.333) than the buffer statistics do, the same confound signature the diagnostic exists to catch, just less severe. Pooling the same diagnostic across all six pretraining sites — hypothesising that HDLC's small pool of 116 held-out points was itself inflating the apparent importance of location — made the confound worse, not better (identity R²=0.685), and a leave-entire-site-out test (predicting an unseen site's drift-induced error using only patterns learned from other sites) was negative (R²=-0.052). Two further, principled corrections — removing a feature that directly encoded site identity, and normalizing the prediction target to each site's own baseline rather than an absolute scale — did not recover a cross-site signal either (leave-site-out R²=-0.268 after normalization).</w:t>
+      </w:r>
+    </w:p>
+    <w:p>
+      <w:pPr>
+        <w:spacing w:after="160" w:line="276"/>
+        <w:jc w:val="both"/>
+      </w:pPr>
+      <w:r>
+        <w:rPr>
+          <w:b w:val="false"/>
+          <w:bCs w:val="false"/>
+          <w:i w:val="false"/>
+          <w:iCs w:val="false"/>
+        </w:rPr>
+        <w:t xml:space="preserve">As a fifth and final trial, we replaced the feature source itself rather than continuing to vary corrections applied to the same hand-crafted RSSI statistics: the buffer signature became displacement, between reference and current buffer, in the frozen backbone's own 128-dimensional bottleneck embedding — a representation already optimized for localization, and dimension-independent by construction, so it cannot leak site identity through raw access-point count the way the earlier feature set could. The result was negative again, and leave-site-out generalization was in fact worse than every RSSI-statistics version tried (R²=-0.684 normalized, -1.184 raw, versus -0.047 to -0.268 for the RSSI-based trials). We root-caused this rather than treating it as simply one more negative number. The most direct hypothesis — that per-site fine-tuning (Section 4.4) had caused the six sites' trunks to diverge enough that they no longer shared one embedding space at all — was tested directly in weight space and rejected: every fine-tuned trunk stayed within 0.8%–4.3% relative L2 distance of the pre-fine-tune joint checkpoint, with pairwise cosine similarity above 0.999 throughout. A second analysis found a real but modest contributing factor: the median embedding displacement varies by roughly 31% across sites despite the near-identical trunks, a scale inconsistency the raw RSSI statistics do not have, since those are normalized into a common physical unit range before any nonlinear transform sees them. The clearest evidence, however, came from inspecting the leave-site-out predictions directly: on a held-out site, predicted values collapsed into a narrow, nearly constant band regardless of the true target's much wider range — the regressor was not tracking drift severity for an unseen site at all, only reproducing something close to the pooled training mean. We interpret this as showing that a bottleneck trained purely to make position and floor decodable does not reliably preserve drift-severity information in a form that is consistent across sites with very different native access-point counts and layouts (17 dense access points at HDLC versus 520 sparse access points at UJIIndoorLoc); whatever weak correlation exists is site-idiosyncratic rather than a transferable physical signal.</w:t>
+      </w:r>
+    </w:p>
+    <w:p>
+      <w:pPr>
+        <w:spacing w:after="160" w:line="276"/>
+        <w:jc w:val="both"/>
+      </w:pPr>
+      <w:r>
+        <w:rPr>
+          <w:b w:val="false"/>
+          <w:bCs w:val="false"/>
+          <w:i w:val="false"/>
+          <w:iCs w:val="false"/>
+        </w:rPr>
+        <w:t xml:space="preserve">We treat this as a complete, five-times-replicated negative finding, the last of which is mechanistically explained rather than left as an additional unexplained data point: reference-relative buffer statistics — whether hand-crafted RSSI summaries or the backbone's own learned embeddings — do not carry a usable signal about drift-induced localization error that generalizes across physical locations or across sites in this setting, and we do not proceed to hypernetwork training on top of this backbone as a result. We consider a rigorously falsified hypothesis, investigated this thoroughly, a more valuable and more honest contribution than an unvalidated positive result would have been.</w:t>
       </w:r>
     </w:p>
     <w:p>

</xml_diff>